<commit_message>
AROYA audit: facility 3754 (POWRHOUSE) — 2026-05-26..2026-06-09
</commit_message>
<xml_diff>
--- a/facility_audit_3754_talking_points.docx
+++ b/facility_audit_3754_talking_points.docx
@@ -7,12 +7,12 @@
         <w:pStyle w:val="Title"/>
       </w:pPr>
       <w:r>
-        <w:t>Facility Audit Talking Points — Burly Botanicals</w:t>
+        <w:t>Facility Audit Talking Points — POWRHOUSE</w:t>
       </w:r>
     </w:p>
     <w:p>
       <w:r>
-        <w:t>Window: 2026-04-01 -&gt; 2026-05-13 (42 days). Irrigation framing: P0/P1/P2/P3, absolute pp dryback.</w:t>
+        <w:t>Window: 2026-05-26 -&gt; 2026-06-09 (14 days). Irrigation framing: P0/P1/P2/P3, absolute pp dryback.</w:t>
       </w:r>
     </w:p>
     <w:p>
@@ -20,17 +20,17 @@
         <w:pStyle w:val="Heading1"/>
       </w:pPr>
       <w:r>
-        <w:t>BULK-1 — bulking (vegetatively-steered)</w:t>
+        <w:t>POWR 1 — veg (vegetatively-steered)</w:t>
       </w:r>
     </w:p>
     <w:p>
       <w:r>
-        <w:t>BULK-1 is vegetatively-steered this week. Overnight dryback ran 9.6 absolute pp against a bulking target band of 12-18 absolute pp; shot cadence held the P1/P2 schedule with P3 driving steering.</w:t>
+        <w:t>POWR 1 is vegetatively-steered this week. Overnight dryback ran 52.2 absolute pp against a veg target band of 5-15 absolute pp; shot cadence held the P1/P2 schedule with P3 driving steering.</w:t>
       </w:r>
     </w:p>
     <w:p>
       <w:r>
-        <w:t>Dryback: 9.6 absolute pp | EC stack: 1.68 mS/cm | VPD mean: 1.35 kPa</w:t>
+        <w:t>Dryback: 52.2 absolute pp | EC stack: -0.75 mS/cm | VPD mean: 0.92 kPa</w:t>
       </w:r>
     </w:p>
     <w:p>
@@ -38,17 +38,17 @@
         <w:pStyle w:val="Heading1"/>
       </w:pPr>
       <w:r>
-        <w:t>FLOWER-2 — early_flower (generatively-steered)</w:t>
+        <w:t>POWR 2 — veg (vegetatively-steered)</w:t>
       </w:r>
     </w:p>
     <w:p>
       <w:r>
-        <w:t>FLOWER-2 is generatively-steered this week. Overnight dryback ran 14.4 absolute pp against a early_flower target band of 20-30 absolute pp; shot cadence held the P1/P2 schedule with P3 driving steering.</w:t>
+        <w:t>POWR 2 is vegetatively-steered this week. Overnight dryback ran 33.0 absolute pp against a veg target band of 5-15 absolute pp; shot cadence held the P1/P2 schedule with P3 driving steering.</w:t>
       </w:r>
     </w:p>
     <w:p>
       <w:r>
-        <w:t>Dryback: 14.4 absolute pp | EC stack: 1.68 mS/cm | VPD mean: 1.1 kPa</w:t>
+        <w:t>Dryback: 33.0 absolute pp | EC stack: -0.28 mS/cm | VPD mean: 0.76 kPa</w:t>
       </w:r>
     </w:p>
     <w:p>
@@ -56,17 +56,125 @@
         <w:pStyle w:val="Heading1"/>
       </w:pPr>
       <w:r>
-        <w:t>VEG-1 — veg (vegetatively-steered)</w:t>
+        <w:t>POWR 3 — veg (vegetatively-steered)</w:t>
       </w:r>
     </w:p>
     <w:p>
       <w:r>
-        <w:t>VEG-1 is vegetatively-steered this week. Overnight dryback ran 6.0 absolute pp against a veg target band of 5-15 absolute pp; shot cadence held the P1/P2 schedule with P3 driving steering.</w:t>
+        <w:t>POWR 3 is vegetatively-steered this week. Overnight dryback ran 57.1 absolute pp against a veg target band of 5-15 absolute pp; shot cadence held the P1/P2 schedule with P3 driving steering.</w:t>
       </w:r>
     </w:p>
     <w:p>
       <w:r>
-        <w:t>Dryback: 6.0 absolute pp | EC stack: 1.68 mS/cm | VPD mean: 0.95 kPa</w:t>
+        <w:t>Dryback: 57.1 absolute pp | EC stack: 0.82 mS/cm | VPD mean: 1.16 kPa</w:t>
+      </w:r>
+    </w:p>
+    <w:p>
+      <w:pPr>
+        <w:pStyle w:val="Heading1"/>
+      </w:pPr>
+      <w:r>
+        <w:t>POWR 4 — veg (vegetatively-steered)</w:t>
+      </w:r>
+    </w:p>
+    <w:p>
+      <w:r>
+        <w:t>POWR 4 is vegetatively-steered this week. Overnight dryback ran 33.4 absolute pp against a veg target band of 5-15 absolute pp; shot cadence held the P1/P2 schedule with P3 driving steering.</w:t>
+      </w:r>
+    </w:p>
+    <w:p>
+      <w:r>
+        <w:t>Dryback: 33.4 absolute pp | EC stack: -0.32 mS/cm | VPD mean: 0.87 kPa</w:t>
+      </w:r>
+    </w:p>
+    <w:p>
+      <w:pPr>
+        <w:pStyle w:val="Heading1"/>
+      </w:pPr>
+      <w:r>
+        <w:t>Veg Room — veg (vegetatively-steered)</w:t>
+      </w:r>
+    </w:p>
+    <w:p>
+      <w:r>
+        <w:t>Veg Room is vegetatively-steered this week. Overnight dryback ran 25.1 absolute pp against a veg target band of 5-15 absolute pp; shot cadence held the P1/P2 schedule with P3 driving steering.</w:t>
+      </w:r>
+    </w:p>
+    <w:p>
+      <w:r>
+        <w:t>Dryback: 25.1 absolute pp | EC stack: 2.59 mS/cm | VPD mean: 0.88 kPa</w:t>
+      </w:r>
+    </w:p>
+    <w:p>
+      <w:pPr>
+        <w:pStyle w:val="Heading1"/>
+      </w:pPr>
+      <w:r>
+        <w:t>Dry 1 — veg (vegetatively-steered)</w:t>
+      </w:r>
+    </w:p>
+    <w:p>
+      <w:r>
+        <w:t>Dry 1 is vegetatively-steered this week. Overnight dryback ran 0.0 absolute pp against a veg target band of 5-15 absolute pp; shot cadence held the P1/P2 schedule with P3 driving steering.</w:t>
+      </w:r>
+    </w:p>
+    <w:p>
+      <w:r>
+        <w:t>Dryback: 0.0 absolute pp | EC stack: 0.0 mS/cm | VPD mean: 0.71 kPa</w:t>
+      </w:r>
+    </w:p>
+    <w:p>
+      <w:pPr>
+        <w:pStyle w:val="Heading1"/>
+      </w:pPr>
+      <w:r>
+        <w:t>Dry 2 — veg (vegetatively-steered)</w:t>
+      </w:r>
+    </w:p>
+    <w:p>
+      <w:r>
+        <w:t>Dry 2 is vegetatively-steered this week. Overnight dryback ran 0.0 absolute pp against a veg target band of 5-15 absolute pp; shot cadence held the P1/P2 schedule with P3 driving steering.</w:t>
+      </w:r>
+    </w:p>
+    <w:p>
+      <w:r>
+        <w:t>Dryback: 0.0 absolute pp | EC stack: 0.0 mS/cm | VPD mean: 0.71 kPa</w:t>
+      </w:r>
+    </w:p>
+    <w:p>
+      <w:pPr>
+        <w:pStyle w:val="Heading1"/>
+      </w:pPr>
+      <w:r>
+        <w:t>Vault — veg (vegetatively-steered)</w:t>
+      </w:r>
+    </w:p>
+    <w:p>
+      <w:r>
+        <w:t>Vault is vegetatively-steered this week. Overnight dryback ran 0.0 absolute pp against a veg target band of 5-15 absolute pp; shot cadence held the P1/P2 schedule with P3 driving steering.</w:t>
+      </w:r>
+    </w:p>
+    <w:p>
+      <w:r>
+        <w:t>Dryback: 0.0 absolute pp | EC stack: 0.0 mS/cm | VPD mean: 0.66 kPa</w:t>
+      </w:r>
+    </w:p>
+    <w:p>
+      <w:pPr>
+        <w:pStyle w:val="Heading1"/>
+      </w:pPr>
+      <w:r>
+        <w:t>Cure — veg (vegetatively-steered)</w:t>
+      </w:r>
+    </w:p>
+    <w:p>
+      <w:r>
+        <w:t>Cure is vegetatively-steered this week. Overnight dryback ran 0.0 absolute pp against a veg target band of 5-15 absolute pp; shot cadence held the P1/P2 schedule with P3 driving steering.</w:t>
+      </w:r>
+    </w:p>
+    <w:p>
+      <w:r>
+        <w:t>Dryback: 0.0 absolute pp | EC stack: 0.0 mS/cm | VPD mean: 0.9 kPa</w:t>
       </w:r>
     </w:p>
     <w:sectPr>

</xml_diff>

<commit_message>
AROYA audit: facility 3754 (Burly Botanicals) — 2026-04-01..2026-05-13
</commit_message>
<xml_diff>
--- a/facility_audit_3754_talking_points.docx
+++ b/facility_audit_3754_talking_points.docx
@@ -7,12 +7,12 @@
         <w:pStyle w:val="Title"/>
       </w:pPr>
       <w:r>
-        <w:t>Facility Audit Talking Points — POWRHOUSE</w:t>
+        <w:t>Facility Audit Talking Points — Burly Botanicals</w:t>
       </w:r>
     </w:p>
     <w:p>
       <w:r>
-        <w:t>Window: 2026-05-26 -&gt; 2026-06-09 (14 days). Irrigation framing: P0/P1/P2/P3, absolute pp dryback.</w:t>
+        <w:t>Window: 2026-04-01 -&gt; 2026-05-13 (42 days). Irrigation framing: P0/P1/P2/P3, absolute pp dryback.</w:t>
       </w:r>
     </w:p>
     <w:p>
@@ -20,17 +20,17 @@
         <w:pStyle w:val="Heading1"/>
       </w:pPr>
       <w:r>
-        <w:t>POWR 1 — veg (vegetatively-steered)</w:t>
+        <w:t>BULK-1 — bulking (vegetatively-steered)</w:t>
       </w:r>
     </w:p>
     <w:p>
       <w:r>
-        <w:t>POWR 1 is vegetatively-steered this week. Overnight dryback ran 52.2 absolute pp against a veg target band of 5-15 absolute pp; shot cadence held the P1/P2 schedule with P3 driving steering.</w:t>
+        <w:t>BULK-1 is vegetatively-steered this week. Overnight dryback ran 9.6 absolute pp against a bulking target band of 12-18 absolute pp; shot cadence held the P1/P2 schedule with P3 driving steering.</w:t>
       </w:r>
     </w:p>
     <w:p>
       <w:r>
-        <w:t>Dryback: 52.2 absolute pp | EC stack: -0.75 mS/cm | VPD mean: 0.92 kPa</w:t>
+        <w:t>Dryback: 9.6 absolute pp | EC stack: 1.68 mS/cm | VPD mean: 1.35 kPa</w:t>
       </w:r>
     </w:p>
     <w:p>
@@ -38,17 +38,17 @@
         <w:pStyle w:val="Heading1"/>
       </w:pPr>
       <w:r>
-        <w:t>POWR 2 — veg (vegetatively-steered)</w:t>
+        <w:t>FLOWER-2 — early_flower (generatively-steered)</w:t>
       </w:r>
     </w:p>
     <w:p>
       <w:r>
-        <w:t>POWR 2 is vegetatively-steered this week. Overnight dryback ran 33.0 absolute pp against a veg target band of 5-15 absolute pp; shot cadence held the P1/P2 schedule with P3 driving steering.</w:t>
+        <w:t>FLOWER-2 is generatively-steered this week. Overnight dryback ran 14.4 absolute pp against a early_flower target band of 20-30 absolute pp; shot cadence held the P1/P2 schedule with P3 driving steering.</w:t>
       </w:r>
     </w:p>
     <w:p>
       <w:r>
-        <w:t>Dryback: 33.0 absolute pp | EC stack: -0.28 mS/cm | VPD mean: 0.76 kPa</w:t>
+        <w:t>Dryback: 14.4 absolute pp | EC stack: 1.68 mS/cm | VPD mean: 1.1 kPa</w:t>
       </w:r>
     </w:p>
     <w:p>
@@ -56,125 +56,17 @@
         <w:pStyle w:val="Heading1"/>
       </w:pPr>
       <w:r>
-        <w:t>POWR 3 — veg (vegetatively-steered)</w:t>
+        <w:t>VEG-1 — veg (vegetatively-steered)</w:t>
       </w:r>
     </w:p>
     <w:p>
       <w:r>
-        <w:t>POWR 3 is vegetatively-steered this week. Overnight dryback ran 57.1 absolute pp against a veg target band of 5-15 absolute pp; shot cadence held the P1/P2 schedule with P3 driving steering.</w:t>
+        <w:t>VEG-1 is vegetatively-steered this week. Overnight dryback ran 6.0 absolute pp against a veg target band of 5-15 absolute pp; shot cadence held the P1/P2 schedule with P3 driving steering.</w:t>
       </w:r>
     </w:p>
     <w:p>
       <w:r>
-        <w:t>Dryback: 57.1 absolute pp | EC stack: 0.82 mS/cm | VPD mean: 1.16 kPa</w:t>
-      </w:r>
-    </w:p>
-    <w:p>
-      <w:pPr>
-        <w:pStyle w:val="Heading1"/>
-      </w:pPr>
-      <w:r>
-        <w:t>POWR 4 — veg (vegetatively-steered)</w:t>
-      </w:r>
-    </w:p>
-    <w:p>
-      <w:r>
-        <w:t>POWR 4 is vegetatively-steered this week. Overnight dryback ran 33.4 absolute pp against a veg target band of 5-15 absolute pp; shot cadence held the P1/P2 schedule with P3 driving steering.</w:t>
-      </w:r>
-    </w:p>
-    <w:p>
-      <w:r>
-        <w:t>Dryback: 33.4 absolute pp | EC stack: -0.32 mS/cm | VPD mean: 0.87 kPa</w:t>
-      </w:r>
-    </w:p>
-    <w:p>
-      <w:pPr>
-        <w:pStyle w:val="Heading1"/>
-      </w:pPr>
-      <w:r>
-        <w:t>Veg Room — veg (vegetatively-steered)</w:t>
-      </w:r>
-    </w:p>
-    <w:p>
-      <w:r>
-        <w:t>Veg Room is vegetatively-steered this week. Overnight dryback ran 25.1 absolute pp against a veg target band of 5-15 absolute pp; shot cadence held the P1/P2 schedule with P3 driving steering.</w:t>
-      </w:r>
-    </w:p>
-    <w:p>
-      <w:r>
-        <w:t>Dryback: 25.1 absolute pp | EC stack: 2.59 mS/cm | VPD mean: 0.88 kPa</w:t>
-      </w:r>
-    </w:p>
-    <w:p>
-      <w:pPr>
-        <w:pStyle w:val="Heading1"/>
-      </w:pPr>
-      <w:r>
-        <w:t>Dry 1 — veg (vegetatively-steered)</w:t>
-      </w:r>
-    </w:p>
-    <w:p>
-      <w:r>
-        <w:t>Dry 1 is vegetatively-steered this week. Overnight dryback ran 0.0 absolute pp against a veg target band of 5-15 absolute pp; shot cadence held the P1/P2 schedule with P3 driving steering.</w:t>
-      </w:r>
-    </w:p>
-    <w:p>
-      <w:r>
-        <w:t>Dryback: 0.0 absolute pp | EC stack: 0.0 mS/cm | VPD mean: 0.71 kPa</w:t>
-      </w:r>
-    </w:p>
-    <w:p>
-      <w:pPr>
-        <w:pStyle w:val="Heading1"/>
-      </w:pPr>
-      <w:r>
-        <w:t>Dry 2 — veg (vegetatively-steered)</w:t>
-      </w:r>
-    </w:p>
-    <w:p>
-      <w:r>
-        <w:t>Dry 2 is vegetatively-steered this week. Overnight dryback ran 0.0 absolute pp against a veg target band of 5-15 absolute pp; shot cadence held the P1/P2 schedule with P3 driving steering.</w:t>
-      </w:r>
-    </w:p>
-    <w:p>
-      <w:r>
-        <w:t>Dryback: 0.0 absolute pp | EC stack: 0.0 mS/cm | VPD mean: 0.71 kPa</w:t>
-      </w:r>
-    </w:p>
-    <w:p>
-      <w:pPr>
-        <w:pStyle w:val="Heading1"/>
-      </w:pPr>
-      <w:r>
-        <w:t>Vault — veg (vegetatively-steered)</w:t>
-      </w:r>
-    </w:p>
-    <w:p>
-      <w:r>
-        <w:t>Vault is vegetatively-steered this week. Overnight dryback ran 0.0 absolute pp against a veg target band of 5-15 absolute pp; shot cadence held the P1/P2 schedule with P3 driving steering.</w:t>
-      </w:r>
-    </w:p>
-    <w:p>
-      <w:r>
-        <w:t>Dryback: 0.0 absolute pp | EC stack: 0.0 mS/cm | VPD mean: 0.66 kPa</w:t>
-      </w:r>
-    </w:p>
-    <w:p>
-      <w:pPr>
-        <w:pStyle w:val="Heading1"/>
-      </w:pPr>
-      <w:r>
-        <w:t>Cure — veg (vegetatively-steered)</w:t>
-      </w:r>
-    </w:p>
-    <w:p>
-      <w:r>
-        <w:t>Cure is vegetatively-steered this week. Overnight dryback ran 0.0 absolute pp against a veg target band of 5-15 absolute pp; shot cadence held the P1/P2 schedule with P3 driving steering.</w:t>
-      </w:r>
-    </w:p>
-    <w:p>
-      <w:r>
-        <w:t>Dryback: 0.0 absolute pp | EC stack: 0.0 mS/cm | VPD mean: 0.9 kPa</w:t>
+        <w:t>Dryback: 6.0 absolute pp | EC stack: 1.68 mS/cm | VPD mean: 0.95 kPa</w:t>
       </w:r>
     </w:p>
     <w:sectPr>

</xml_diff>